<commit_message>
Integrate Sept 2025 poll crosstabs, update model scoring, improve dashboard UI
- Calibration script reads Sept 2025 Excel crosstabs directly (60/40 blend with Feb 2026)
- Support model: Hispanic/Latino +4pts (blended 44% support), D5/D9 geography +3pts (48.6%)
- Dashboard: clearer precinct lines, proper layer toggling, indented universe descriptions
- Memo: all numbers updated to reflect new model output
- New VAN universe export script (12_export_van_universes.py)

Net impact: Base +6,485 voters (39.5%), Opposition -6,778 (23.0%), D5 Base 25.1%→30.6%

Co-Authored-By: Claude Opus 4.6 <noreply@anthropic.com>
</commit_message>
<xml_diff>
--- a/output/targeting_memo.docx
+++ b/output/targeting_memo.docx
@@ -6,6 +6,21 @@
     <w:p/>
     <w:p/>
     <w:p/>
+    <w:p>
+      <w:pPr>
+        <w:spacing w:after="80"/>
+        <w:jc w:val="center"/>
+      </w:pPr>
+      <w:r>
+        <w:rPr>
+          <w:rFonts w:ascii="Calibri" w:hAnsi="Calibri"/>
+          <w:b/>
+          <w:color w:val="CC0000"/>
+          <w:sz w:val="24"/>
+        </w:rPr>
+        <w:t>CONFIDENTIAL</w:t>
+      </w:r>
+    </w:p>
     <w:p>
       <w:pPr>
         <w:spacing w:after="120"/>
@@ -51,20 +66,68 @@
       </w:pPr>
       <w:r>
         <w:rPr>
+          <w:rFonts w:ascii="Calibri" w:hAnsi="Calibri"/>
           <w:b/>
+          <w:color w:val="1B2A4A"/>
           <w:sz w:val="22"/>
-          <w:szCs w:val="22"/>
+        </w:rPr>
+        <w:t xml:space="preserve">Date:  </w:t>
+      </w:r>
+      <w:r>
+        <w:rPr>
+          <w:rFonts w:ascii="Calibri" w:hAnsi="Calibri"/>
+          <w:color w:val="333333"/>
+          <w:sz w:val="22"/>
+        </w:rPr>
+        <w:t>April 2026</w:t>
+      </w:r>
+    </w:p>
+    <w:p>
+      <w:pPr>
+        <w:spacing w:after="40"/>
+        <w:ind w:left="2160"/>
+        <w:jc w:val="left"/>
+      </w:pPr>
+      <w:r>
+        <w:rPr>
+          <w:rFonts w:ascii="Calibri" w:hAnsi="Calibri"/>
+          <w:b/>
           <w:color w:val="1B2A4A"/>
+          <w:sz w:val="22"/>
         </w:rPr>
         <w:t xml:space="preserve">To:  </w:t>
       </w:r>
       <w:r>
         <w:rPr>
+          <w:rFonts w:ascii="Calibri" w:hAnsi="Calibri"/>
+          <w:color w:val="333333"/>
           <w:sz w:val="22"/>
-          <w:szCs w:val="22"/>
-          <w:color w:val="333333"/>
         </w:rPr>
         <w:t>Campaign Leadership</w:t>
+      </w:r>
+    </w:p>
+    <w:p>
+      <w:pPr>
+        <w:spacing w:after="40"/>
+        <w:ind w:left="2160"/>
+        <w:jc w:val="left"/>
+      </w:pPr>
+      <w:r>
+        <w:rPr>
+          <w:rFonts w:ascii="Calibri" w:hAnsi="Calibri"/>
+          <w:b/>
+          <w:color w:val="1B2A4A"/>
+          <w:sz w:val="22"/>
+        </w:rPr>
+        <w:t xml:space="preserve">From:  </w:t>
+      </w:r>
+      <w:r>
+        <w:rPr>
+          <w:rFonts w:ascii="Calibri" w:hAnsi="Calibri"/>
+          <w:color w:val="333333"/>
+          <w:sz w:val="22"/>
+        </w:rPr>
+        <w:t>Data &amp; Analytics Team</w:t>
       </w:r>
     </w:p>
     <w:p>
@@ -120,7 +183,7 @@
           <w:color w:val="333333"/>
           <w:sz w:val="22"/>
         </w:rPr>
-        <w:t>This memo presents the results of our voter targeting model for California's 11th Congressional District (San Francisco, Supervisor Districts 1–10) ahead of the June 2026 Democratic primary election. The model assigns every registered voter a composite support score (0–100) calibrated against EMC Research polling and segments the electorate into three strategic universes: Base, Persuasion, and Opposition.</w:t>
+        <w:t>This memo presents the results of our voter targeting model for California's 11th Congressional District (San Francisco, Supervisor Districts 1–10) ahead of the June 2026 Democratic primary election. The model assigns every registered voter a composite support score (0–100) calibrated against EMC Research polling (February 2026 and September 2025) and segments the electorate into three strategic universes: Base, Persuasion, and Opposition.</w:t>
       </w:r>
     </w:p>
     <w:p>
@@ -183,7 +246,7 @@
           <w:color w:val="333333"/>
           <w:sz w:val="22"/>
         </w:rPr>
-        <w:t>Base 170,727 (38.1%) | Persuasion 167,890 (37.4%) | Opposition 109,759 (24.5%)</w:t>
+        <w:t>Base 177,212 (39.5%) | Persuasion 168,183 (37.5%) | Opposition 102,981 (23.0%)</w:t>
       </w:r>
     </w:p>
     <w:p>
@@ -247,7 +310,7 @@
           <w:color w:val="333333"/>
           <w:sz w:val="22"/>
         </w:rPr>
-        <w:t>Strategic Imperative: Mobilize Base drop-off voters (62,725 supporters with turnout score below 45) and persuade swing voters in Districts 1, 4, 5, and 9.</w:t>
+        <w:t xml:space="preserve">Strategic Imperative: </w:t>
       </w:r>
       <w:r>
         <w:rPr>
@@ -255,6 +318,7 @@
           <w:color w:val="333333"/>
           <w:sz w:val="22"/>
         </w:rPr>
+        <w:t>Mobilize Base drop-off voters (66,155 supporters with low turnout probability) and persuade swing voters in Districts 1, 4, 5, and 9.</w:t>
       </w:r>
     </w:p>
     <w:p/>
@@ -380,8 +444,6 @@
                 <w:sz w:val="18"/>
               </w:rPr>
               <w:t>Avg Turnout</w:t>
-              <w:br/>
-              <w:t>Score</w:t>
             </w:r>
           </w:p>
         </w:tc>
@@ -425,7 +487,7 @@
                 <w:color w:val="333333"/>
                 <w:sz w:val="18"/>
               </w:rPr>
-              <w:t>170,727</w:t>
+              <w:t>177,212</w:t>
             </w:r>
           </w:p>
         </w:tc>
@@ -446,7 +508,7 @@
                 <w:color w:val="333333"/>
                 <w:sz w:val="18"/>
               </w:rPr>
-              <w:t>38.1%</w:t>
+              <w:t>39.5%</w:t>
             </w:r>
           </w:p>
         </w:tc>
@@ -467,7 +529,7 @@
                 <w:color w:val="333333"/>
                 <w:sz w:val="18"/>
               </w:rPr>
-              <w:t>76.6</w:t>
+              <w:t>76.8</w:t>
             </w:r>
           </w:p>
         </w:tc>
@@ -488,7 +550,7 @@
                 <w:color w:val="333333"/>
                 <w:sz w:val="18"/>
               </w:rPr>
-              <w:t>52.1</w:t>
+              <w:t>51.7%</w:t>
             </w:r>
           </w:p>
         </w:tc>
@@ -534,7 +596,7 @@
                 <w:color w:val="333333"/>
                 <w:sz w:val="18"/>
               </w:rPr>
-              <w:t>167,890</w:t>
+              <w:t>168,183</w:t>
             </w:r>
           </w:p>
         </w:tc>
@@ -556,7 +618,7 @@
                 <w:color w:val="333333"/>
                 <w:sz w:val="18"/>
               </w:rPr>
-              <w:t>37.4%</w:t>
+              <w:t>37.5%</w:t>
             </w:r>
           </w:p>
         </w:tc>
@@ -600,7 +662,7 @@
                 <w:color w:val="333333"/>
                 <w:sz w:val="18"/>
               </w:rPr>
-              <w:t>32.5</w:t>
+              <w:t>32.0%</w:t>
             </w:r>
           </w:p>
         </w:tc>
@@ -644,7 +706,7 @@
                 <w:color w:val="333333"/>
                 <w:sz w:val="18"/>
               </w:rPr>
-              <w:t>109,759</w:t>
+              <w:t>102,981</w:t>
             </w:r>
           </w:p>
         </w:tc>
@@ -665,7 +727,7 @@
                 <w:color w:val="333333"/>
                 <w:sz w:val="18"/>
               </w:rPr>
-              <w:t>24.5%</w:t>
+              <w:t>23.0%</w:t>
             </w:r>
           </w:p>
         </w:tc>
@@ -686,7 +748,7 @@
                 <w:color w:val="333333"/>
                 <w:sz w:val="18"/>
               </w:rPr>
-              <w:t>40.7</w:t>
+              <w:t>42.1</w:t>
             </w:r>
           </w:p>
         </w:tc>
@@ -707,7 +769,7 @@
                 <w:color w:val="333333"/>
                 <w:sz w:val="18"/>
               </w:rPr>
-              <w:t>30.2</w:t>
+              <w:t>30.3%</w:t>
             </w:r>
           </w:p>
         </w:tc>
@@ -854,7 +916,7 @@
           <w:color w:val="333333"/>
           <w:sz w:val="22"/>
         </w:rPr>
-        <w:t>Each registered voter in CD-11 receives a composite support score (0–100) derived from eight weighted factors, calibrated against EMC Research polling crosstabs (February 2026, n=800). The model integrates TargetSmart modeled data with geographic, demographic, and behavioral indicators to estimate each voter’s likelihood of supporting Scott Wiener in a head-to-head primary.</w:t>
+        <w:t>Each registered voter in CD-11 receives a composite support score (0–100) derived from eight weighted factors, calibrated against EMC Research polling crosstabs (February 2026, n=800; September 2025, n=500, weighted 60/40). The model integrates TargetSmart modeled data with geographic, demographic, and behavioral indicators to estimate each voter’s likelihood of supporting Scott Wiener in a head-to-head primary.</w:t>
       </w:r>
     </w:p>
     <w:p>
@@ -1410,7 +1472,7 @@
                 <w:color w:val="333333"/>
                 <w:sz w:val="18"/>
               </w:rPr>
-              <w:t>Historical primary turnout (2018–2024); normalized to 0–100 scale</w:t>
+              <w:t>Historical primary turnout (2018–2024)</w:t>
             </w:r>
           </w:p>
         </w:tc>
@@ -1629,7 +1691,7 @@
           <w:color w:val="1B2A4A"/>
           <w:sz w:val="24"/>
         </w:rPr>
-        <w:t>Base Universe (170,727 — 38.1%)</w:t>
+        <w:t>Base Universe (177,212 — 39.5%)</w:t>
       </w:r>
     </w:p>
     <w:p>
@@ -1743,7 +1805,7 @@
                 <w:color w:val="333333"/>
                 <w:sz w:val="18"/>
               </w:rPr>
-              <w:t>76.6</w:t>
+              <w:t>76.8</w:t>
             </w:r>
           </w:p>
         </w:tc>
@@ -1767,7 +1829,7 @@
                 <w:color w:val="333333"/>
                 <w:sz w:val="18"/>
               </w:rPr>
-              <w:t>Average Turnout Score</w:t>
+              <w:t>Average Turnout Probability</w:t>
             </w:r>
           </w:p>
         </w:tc>
@@ -1789,7 +1851,7 @@
                 <w:color w:val="333333"/>
                 <w:sz w:val="18"/>
               </w:rPr>
-              <w:t>52.1</w:t>
+              <w:t>51.7%</w:t>
             </w:r>
           </w:p>
         </w:tc>
@@ -1833,7 +1895,7 @@
                 <w:color w:val="333333"/>
                 <w:sz w:val="18"/>
               </w:rPr>
-              <w:t>77.8%</w:t>
+              <w:t>77.7%</w:t>
             </w:r>
           </w:p>
         </w:tc>
@@ -1879,7 +1941,7 @@
                 <w:color w:val="333333"/>
                 <w:sz w:val="18"/>
               </w:rPr>
-              <w:t>64.1%</w:t>
+              <w:t>63.0%</w:t>
             </w:r>
           </w:p>
         </w:tc>
@@ -1923,7 +1985,7 @@
                 <w:color w:val="333333"/>
                 <w:sz w:val="18"/>
               </w:rPr>
-              <w:t>29.9%</w:t>
+              <w:t>29.4%</w:t>
             </w:r>
           </w:p>
         </w:tc>
@@ -1969,7 +2031,7 @@
                 <w:color w:val="333333"/>
                 <w:sz w:val="18"/>
               </w:rPr>
-              <w:t>49.1%</w:t>
+              <w:t>48.9%</w:t>
             </w:r>
           </w:p>
         </w:tc>
@@ -2013,7 +2075,7 @@
                 <w:color w:val="333333"/>
                 <w:sz w:val="18"/>
               </w:rPr>
-              <w:t>55.5%</w:t>
+              <w:t>55.3%</w:t>
             </w:r>
           </w:p>
         </w:tc>
@@ -2059,7 +2121,7 @@
                 <w:color w:val="333333"/>
                 <w:sz w:val="18"/>
               </w:rPr>
-              <w:t>54.8% Base</w:t>
+              <w:t>55.3% Base</w:t>
             </w:r>
           </w:p>
         </w:tc>
@@ -2103,7 +2165,7 @@
                 <w:color w:val="333333"/>
                 <w:sz w:val="18"/>
               </w:rPr>
-              <w:t>51.2% Base</w:t>
+              <w:t>51.8% Base</w:t>
             </w:r>
           </w:p>
         </w:tc>
@@ -2149,7 +2211,7 @@
                 <w:color w:val="333333"/>
                 <w:sz w:val="18"/>
               </w:rPr>
-              <w:t>49.7% Base</w:t>
+              <w:t>50.0% Base</w:t>
             </w:r>
           </w:p>
         </w:tc>
@@ -2168,7 +2230,7 @@
           <w:color w:val="333333"/>
           <w:sz w:val="22"/>
         </w:rPr>
-        <w:t>Drop-off Base: 62,725 voters (36.7% of Base) are supporters with a turnout probability score below 45 (on the 0–100 scale). These individuals are the campaign’s highest-ROI mobilization targets — they support Scott but may not vote in a June primary without direct contact.</w:t>
+        <w:t>Drop-off Base: 66,155 voters (37.3% of Base) are supporters with low turnout probability. These individuals are the campaign’s highest-ROI mobilization targets — they support Scott but may not vote in a June primary without direct contact.</w:t>
       </w:r>
     </w:p>
     <w:p/>
@@ -2183,7 +2245,7 @@
           <w:color w:val="1B2A4A"/>
           <w:sz w:val="24"/>
         </w:rPr>
-        <w:t>Persuasion Universe (167,890 — 37.4%)</w:t>
+        <w:t>Persuasion Universe (168,183 — 37.5%)</w:t>
       </w:r>
     </w:p>
     <w:p>
@@ -2321,7 +2383,7 @@
                 <w:color w:val="333333"/>
                 <w:sz w:val="18"/>
               </w:rPr>
-              <w:t>Average Turnout Score</w:t>
+              <w:t>Average Turnout Probability</w:t>
             </w:r>
           </w:p>
         </w:tc>
@@ -2343,7 +2405,7 @@
                 <w:color w:val="333333"/>
                 <w:sz w:val="18"/>
               </w:rPr>
-              <w:t>32.5</w:t>
+              <w:t>32.0%</w:t>
             </w:r>
           </w:p>
         </w:tc>
@@ -2387,7 +2449,7 @@
                 <w:color w:val="333333"/>
                 <w:sz w:val="18"/>
               </w:rPr>
-              <w:t>65.0%</w:t>
+              <w:t>64.9%</w:t>
             </w:r>
           </w:p>
         </w:tc>
@@ -2433,7 +2495,7 @@
                 <w:color w:val="333333"/>
                 <w:sz w:val="18"/>
               </w:rPr>
-              <w:t>54.4%</w:t>
+              <w:t>54.0%</w:t>
             </w:r>
           </w:p>
         </w:tc>
@@ -2477,7 +2539,7 @@
                 <w:color w:val="333333"/>
                 <w:sz w:val="18"/>
               </w:rPr>
-              <w:t>30.2%</w:t>
+              <w:t>30.3%</w:t>
             </w:r>
           </w:p>
         </w:tc>
@@ -2523,7 +2585,7 @@
                 <w:color w:val="333333"/>
                 <w:sz w:val="18"/>
               </w:rPr>
-              <w:t>46.1%</w:t>
+              <w:t>46.2%</w:t>
             </w:r>
           </w:p>
         </w:tc>
@@ -2968,7 +3030,7 @@
           <w:color w:val="1B2A4A"/>
           <w:sz w:val="24"/>
         </w:rPr>
-        <w:t>Opposition Universe (109,759 — 24.5%)</w:t>
+        <w:t>Opposition Universe (102,981 — 23.0%)</w:t>
       </w:r>
     </w:p>
     <w:p>
@@ -3128,7 +3190,7 @@
                 <w:color w:val="333333"/>
                 <w:sz w:val="18"/>
               </w:rPr>
-              <w:t>37,231</w:t>
+              <w:t>37,232</w:t>
             </w:r>
           </w:p>
         </w:tc>
@@ -3216,7 +3278,7 @@
                 <w:color w:val="333333"/>
                 <w:sz w:val="18"/>
               </w:rPr>
-              <w:t>9,714</w:t>
+              <w:t>9,331</w:t>
             </w:r>
           </w:p>
         </w:tc>
@@ -3238,7 +3300,7 @@
                 <w:color w:val="333333"/>
                 <w:sz w:val="18"/>
               </w:rPr>
-              <w:t>2.2%</w:t>
+              <w:t>2.1%</w:t>
             </w:r>
           </w:p>
         </w:tc>
@@ -3392,7 +3454,7 @@
                 <w:color w:val="333333"/>
                 <w:sz w:val="18"/>
               </w:rPr>
-              <w:t>58,820</w:t>
+              <w:t>52,424</w:t>
             </w:r>
           </w:p>
         </w:tc>
@@ -3414,7 +3476,7 @@
                 <w:color w:val="333333"/>
                 <w:sz w:val="18"/>
               </w:rPr>
-              <w:t>13.1%</w:t>
+              <w:t>11.7%</w:t>
             </w:r>
           </w:p>
         </w:tc>
@@ -3726,7 +3788,7 @@
                 <w:color w:val="333333"/>
                 <w:sz w:val="18"/>
               </w:rPr>
-              <w:t>35,210</w:t>
+              <w:t>58,030</w:t>
             </w:r>
           </w:p>
         </w:tc>
@@ -3747,7 +3809,7 @@
                 <w:color w:val="333333"/>
                 <w:sz w:val="18"/>
               </w:rPr>
-              <w:t>19,295</w:t>
+              <w:t>32,119</w:t>
             </w:r>
           </w:p>
         </w:tc>
@@ -3768,7 +3830,7 @@
                 <w:color w:val="333333"/>
                 <w:sz w:val="18"/>
               </w:rPr>
-              <w:t>54.8%</w:t>
+              <w:t>55.3%</w:t>
             </w:r>
           </w:p>
         </w:tc>
@@ -3789,7 +3851,7 @@
                 <w:color w:val="333333"/>
                 <w:sz w:val="18"/>
               </w:rPr>
-              <w:t>30.7%</w:t>
+              <w:t>33.8%</w:t>
             </w:r>
           </w:p>
         </w:tc>
@@ -3810,7 +3872,7 @@
                 <w:color w:val="333333"/>
                 <w:sz w:val="18"/>
               </w:rPr>
-              <w:t>14.5%</w:t>
+              <w:t>10.9%</w:t>
             </w:r>
           </w:p>
         </w:tc>
@@ -3878,7 +3940,7 @@
                 <w:color w:val="333333"/>
                 <w:sz w:val="18"/>
               </w:rPr>
-              <w:t>48,620</w:t>
+              <w:t>50,330</w:t>
             </w:r>
           </w:p>
         </w:tc>
@@ -3900,7 +3962,7 @@
                 <w:color w:val="333333"/>
                 <w:sz w:val="18"/>
               </w:rPr>
-              <w:t>24,893</w:t>
+              <w:t>26,047</w:t>
             </w:r>
           </w:p>
         </w:tc>
@@ -3922,7 +3984,7 @@
                 <w:color w:val="333333"/>
                 <w:sz w:val="18"/>
               </w:rPr>
-              <w:t>51.2%</w:t>
+              <w:t>51.8%</w:t>
             </w:r>
           </w:p>
         </w:tc>
@@ -3944,7 +4006,7 @@
                 <w:color w:val="333333"/>
                 <w:sz w:val="18"/>
               </w:rPr>
-              <w:t>32.4%</w:t>
+              <w:t>30.1%</w:t>
             </w:r>
           </w:p>
         </w:tc>
@@ -3966,7 +4028,7 @@
                 <w:color w:val="333333"/>
                 <w:sz w:val="18"/>
               </w:rPr>
-              <w:t>16.4%</w:t>
+              <w:t>18.1%</w:t>
             </w:r>
           </w:p>
         </w:tc>
@@ -4031,7 +4093,7 @@
                 <w:color w:val="333333"/>
                 <w:sz w:val="18"/>
               </w:rPr>
-              <w:t>42,380</w:t>
+              <w:t>48,283</w:t>
             </w:r>
           </w:p>
         </w:tc>
@@ -4052,7 +4114,7 @@
                 <w:color w:val="333333"/>
                 <w:sz w:val="18"/>
               </w:rPr>
-              <w:t>21,063</w:t>
+              <w:t>24,128</w:t>
             </w:r>
           </w:p>
         </w:tc>
@@ -4073,7 +4135,7 @@
                 <w:color w:val="333333"/>
                 <w:sz w:val="18"/>
               </w:rPr>
-              <w:t>49.7%</w:t>
+              <w:t>50.0%</w:t>
             </w:r>
           </w:p>
         </w:tc>
@@ -4094,7 +4156,7 @@
                 <w:color w:val="333333"/>
                 <w:sz w:val="18"/>
               </w:rPr>
-              <w:t>33.1%</w:t>
+              <w:t>34.7%</w:t>
             </w:r>
           </w:p>
         </w:tc>
@@ -4115,7 +4177,7 @@
                 <w:color w:val="333333"/>
                 <w:sz w:val="18"/>
               </w:rPr>
-              <w:t>17.2%</w:t>
+              <w:t>15.4%</w:t>
             </w:r>
           </w:p>
         </w:tc>
@@ -4183,7 +4245,7 @@
                 <w:color w:val="333333"/>
                 <w:sz w:val="18"/>
               </w:rPr>
-              <w:t>39,750</w:t>
+              <w:t>42,689</w:t>
             </w:r>
           </w:p>
         </w:tc>
@@ -4205,7 +4267,7 @@
                 <w:color w:val="333333"/>
                 <w:sz w:val="18"/>
               </w:rPr>
-              <w:t>18,643</w:t>
+              <w:t>20,163</w:t>
             </w:r>
           </w:p>
         </w:tc>
@@ -4227,7 +4289,7 @@
                 <w:color w:val="333333"/>
                 <w:sz w:val="18"/>
               </w:rPr>
-              <w:t>46.9%</w:t>
+              <w:t>47.2%</w:t>
             </w:r>
           </w:p>
         </w:tc>
@@ -4249,7 +4311,7 @@
                 <w:color w:val="333333"/>
                 <w:sz w:val="18"/>
               </w:rPr>
-              <w:t>34.2%</w:t>
+              <w:t>39.1%</w:t>
             </w:r>
           </w:p>
         </w:tc>
@@ -4271,7 +4333,7 @@
                 <w:color w:val="333333"/>
                 <w:sz w:val="18"/>
               </w:rPr>
-              <w:t>18.9%</w:t>
+              <w:t>13.6%</w:t>
             </w:r>
           </w:p>
         </w:tc>
@@ -4336,7 +4398,7 @@
                 <w:color w:val="333333"/>
                 <w:sz w:val="18"/>
               </w:rPr>
-              <w:t>51,890</w:t>
+              <w:t>36,782</w:t>
             </w:r>
           </w:p>
         </w:tc>
@@ -4357,7 +4419,7 @@
                 <w:color w:val="333333"/>
                 <w:sz w:val="18"/>
               </w:rPr>
-              <w:t>22,572</w:t>
+              <w:t>16,226</w:t>
             </w:r>
           </w:p>
         </w:tc>
@@ -4378,7 +4440,7 @@
                 <w:color w:val="333333"/>
                 <w:sz w:val="18"/>
               </w:rPr>
-              <w:t>43.5%</w:t>
+              <w:t>44.1%</w:t>
             </w:r>
           </w:p>
         </w:tc>
@@ -4399,7 +4461,7 @@
                 <w:color w:val="333333"/>
                 <w:sz w:val="18"/>
               </w:rPr>
-              <w:t>35.8%</w:t>
+              <w:t>41.6%</w:t>
             </w:r>
           </w:p>
         </w:tc>
@@ -4420,7 +4482,7 @@
                 <w:color w:val="333333"/>
                 <w:sz w:val="18"/>
               </w:rPr>
-              <w:t>20.7%</w:t>
+              <w:t>14.3%</w:t>
             </w:r>
           </w:p>
         </w:tc>
@@ -4488,7 +4550,7 @@
                 <w:color w:val="333333"/>
                 <w:sz w:val="18"/>
               </w:rPr>
-              <w:t>46,310</w:t>
+              <w:t>39,395</w:t>
             </w:r>
           </w:p>
         </w:tc>
@@ -4510,7 +4572,7 @@
                 <w:color w:val="333333"/>
                 <w:sz w:val="18"/>
               </w:rPr>
-              <w:t>16,396</w:t>
+              <w:t>13,584</w:t>
             </w:r>
           </w:p>
         </w:tc>
@@ -4532,7 +4594,7 @@
                 <w:color w:val="333333"/>
                 <w:sz w:val="18"/>
               </w:rPr>
-              <w:t>35.4%</w:t>
+              <w:t>34.5%</w:t>
             </w:r>
           </w:p>
         </w:tc>
@@ -4554,7 +4616,7 @@
                 <w:color w:val="333333"/>
                 <w:sz w:val="18"/>
               </w:rPr>
-              <w:t>38.9%</w:t>
+              <w:t>39.0%</w:t>
             </w:r>
           </w:p>
         </w:tc>
@@ -4576,312 +4638,7 @@
                 <w:color w:val="333333"/>
                 <w:sz w:val="18"/>
               </w:rPr>
-              <w:t>25.7%</w:t>
-            </w:r>
-          </w:p>
-        </w:tc>
-      </w:tr>
-      <w:tr>
-        <w:tc>
-          <w:tcPr>
-            <w:tcW w:type="dxa" w:w="720"/>
-          </w:tcPr>
-          <w:p>
-            <w:pPr>
-              <w:spacing w:before="40" w:after="40"/>
-              <w:jc w:val="center"/>
-            </w:pPr>
-            <w:r/>
-            <w:r>
-              <w:rPr>
-                <w:rFonts w:ascii="Calibri" w:hAnsi="Calibri"/>
-                <w:b/>
-                <w:color w:val="333333"/>
-                <w:sz w:val="18"/>
-              </w:rPr>
-              <w:t>D1</w:t>
-            </w:r>
-          </w:p>
-        </w:tc>
-        <w:tc>
-          <w:tcPr>
-            <w:tcW w:type="dxa" w:w="2448"/>
-          </w:tcPr>
-          <w:p>
-            <w:pPr>
-              <w:spacing w:before="40" w:after="40"/>
-              <w:jc w:val="center"/>
-            </w:pPr>
-            <w:r/>
-            <w:r>
-              <w:rPr>
-                <w:rFonts w:ascii="Calibri" w:hAnsi="Calibri"/>
-                <w:b w:val="0"/>
-                <w:color w:val="333333"/>
-                <w:sz w:val="18"/>
-              </w:rPr>
-              <w:t>Richmond</w:t>
-            </w:r>
-          </w:p>
-        </w:tc>
-        <w:tc>
-          <w:tcPr>
-            <w:tcW w:type="dxa" w:w="1152"/>
-          </w:tcPr>
-          <w:p>
-            <w:pPr>
-              <w:spacing w:before="40" w:after="40"/>
-              <w:jc w:val="center"/>
-            </w:pPr>
-            <w:r/>
-            <w:r>
-              <w:rPr>
-                <w:rFonts w:ascii="Calibri" w:hAnsi="Calibri"/>
-                <w:b w:val="0"/>
-                <w:color w:val="333333"/>
-                <w:sz w:val="18"/>
-              </w:rPr>
-              <w:t>44,520</w:t>
-            </w:r>
-          </w:p>
-        </w:tc>
-        <w:tc>
-          <w:tcPr>
-            <w:tcW w:type="dxa" w:w="1152"/>
-          </w:tcPr>
-          <w:p>
-            <w:pPr>
-              <w:spacing w:before="40" w:after="40"/>
-              <w:jc w:val="center"/>
-            </w:pPr>
-            <w:r/>
-            <w:r>
-              <w:rPr>
-                <w:rFonts w:ascii="Calibri" w:hAnsi="Calibri"/>
-                <w:b w:val="0"/>
-                <w:color w:val="333333"/>
-                <w:sz w:val="18"/>
-              </w:rPr>
-              <w:t>14,693</w:t>
-            </w:r>
-          </w:p>
-        </w:tc>
-        <w:tc>
-          <w:tcPr>
-            <w:tcW w:type="dxa" w:w="1008"/>
-          </w:tcPr>
-          <w:p>
-            <w:pPr>
-              <w:spacing w:before="40" w:after="40"/>
-              <w:jc w:val="center"/>
-            </w:pPr>
-            <w:r/>
-            <w:r>
-              <w:rPr>
-                <w:rFonts w:ascii="Calibri" w:hAnsi="Calibri"/>
-                <w:b w:val="0"/>
-                <w:color w:val="333333"/>
-                <w:sz w:val="18"/>
-              </w:rPr>
-              <w:t>33.0%</w:t>
-            </w:r>
-          </w:p>
-        </w:tc>
-        <w:tc>
-          <w:tcPr>
-            <w:tcW w:type="dxa" w:w="1296"/>
-          </w:tcPr>
-          <w:p>
-            <w:pPr>
-              <w:spacing w:before="40" w:after="40"/>
-              <w:jc w:val="center"/>
-            </w:pPr>
-            <w:r/>
-            <w:r>
-              <w:rPr>
-                <w:rFonts w:ascii="Calibri" w:hAnsi="Calibri"/>
-                <w:b w:val="0"/>
-                <w:color w:val="333333"/>
-                <w:sz w:val="18"/>
-              </w:rPr>
-              <w:t>41.2%</w:t>
-            </w:r>
-          </w:p>
-        </w:tc>
-        <w:tc>
-          <w:tcPr>
-            <w:tcW w:type="dxa" w:w="1296"/>
-          </w:tcPr>
-          <w:p>
-            <w:pPr>
-              <w:spacing w:before="40" w:after="40"/>
-              <w:jc w:val="center"/>
-            </w:pPr>
-            <w:r/>
-            <w:r>
-              <w:rPr>
-                <w:rFonts w:ascii="Calibri" w:hAnsi="Calibri"/>
-                <w:b w:val="0"/>
-                <w:color w:val="333333"/>
-                <w:sz w:val="18"/>
-              </w:rPr>
-              <w:t>25.8%</w:t>
-            </w:r>
-          </w:p>
-        </w:tc>
-      </w:tr>
-      <w:tr>
-        <w:tc>
-          <w:tcPr>
-            <w:tcW w:type="dxa" w:w="720"/>
-            <w:shd w:fill="DBE5F1" w:val="clear"/>
-          </w:tcPr>
-          <w:p>
-            <w:pPr>
-              <w:spacing w:before="40" w:after="40"/>
-              <w:jc w:val="center"/>
-            </w:pPr>
-            <w:r/>
-            <w:r>
-              <w:rPr>
-                <w:rFonts w:ascii="Calibri" w:hAnsi="Calibri"/>
-                <w:b/>
-                <w:color w:val="333333"/>
-                <w:sz w:val="18"/>
-              </w:rPr>
-              <w:t>D4</w:t>
-            </w:r>
-          </w:p>
-        </w:tc>
-        <w:tc>
-          <w:tcPr>
-            <w:tcW w:type="dxa" w:w="2448"/>
-            <w:shd w:fill="DBE5F1" w:val="clear"/>
-          </w:tcPr>
-          <w:p>
-            <w:pPr>
-              <w:spacing w:before="40" w:after="40"/>
-              <w:jc w:val="center"/>
-            </w:pPr>
-            <w:r/>
-            <w:r>
-              <w:rPr>
-                <w:rFonts w:ascii="Calibri" w:hAnsi="Calibri"/>
-                <w:b w:val="0"/>
-                <w:color w:val="333333"/>
-                <w:sz w:val="18"/>
-              </w:rPr>
-              <w:t>Sunset / Parkside</w:t>
-            </w:r>
-          </w:p>
-        </w:tc>
-        <w:tc>
-          <w:tcPr>
-            <w:tcW w:type="dxa" w:w="1152"/>
-            <w:shd w:fill="DBE5F1" w:val="clear"/>
-          </w:tcPr>
-          <w:p>
-            <w:pPr>
-              <w:spacing w:before="40" w:after="40"/>
-              <w:jc w:val="center"/>
-            </w:pPr>
-            <w:r/>
-            <w:r>
-              <w:rPr>
-                <w:rFonts w:ascii="Calibri" w:hAnsi="Calibri"/>
-                <w:b w:val="0"/>
-                <w:color w:val="333333"/>
-                <w:sz w:val="18"/>
-              </w:rPr>
-              <w:t>43,870</w:t>
-            </w:r>
-          </w:p>
-        </w:tc>
-        <w:tc>
-          <w:tcPr>
-            <w:tcW w:type="dxa" w:w="1152"/>
-            <w:shd w:fill="DBE5F1" w:val="clear"/>
-          </w:tcPr>
-          <w:p>
-            <w:pPr>
-              <w:spacing w:before="40" w:after="40"/>
-              <w:jc w:val="center"/>
-            </w:pPr>
-            <w:r/>
-            <w:r>
-              <w:rPr>
-                <w:rFonts w:ascii="Calibri" w:hAnsi="Calibri"/>
-                <w:b w:val="0"/>
-                <w:color w:val="333333"/>
-                <w:sz w:val="18"/>
-              </w:rPr>
-              <w:t>11,318</w:t>
-            </w:r>
-          </w:p>
-        </w:tc>
-        <w:tc>
-          <w:tcPr>
-            <w:tcW w:type="dxa" w:w="1008"/>
-            <w:shd w:fill="DBE5F1" w:val="clear"/>
-          </w:tcPr>
-          <w:p>
-            <w:pPr>
-              <w:spacing w:before="40" w:after="40"/>
-              <w:jc w:val="center"/>
-            </w:pPr>
-            <w:r/>
-            <w:r>
-              <w:rPr>
-                <w:rFonts w:ascii="Calibri" w:hAnsi="Calibri"/>
-                <w:b w:val="0"/>
-                <w:color w:val="333333"/>
-                <w:sz w:val="18"/>
-              </w:rPr>
-              <w:t>25.8%</w:t>
-            </w:r>
-          </w:p>
-        </w:tc>
-        <w:tc>
-          <w:tcPr>
-            <w:tcW w:type="dxa" w:w="1296"/>
-            <w:shd w:fill="DBE5F1" w:val="clear"/>
-          </w:tcPr>
-          <w:p>
-            <w:pPr>
-              <w:spacing w:before="40" w:after="40"/>
-              <w:jc w:val="center"/>
-            </w:pPr>
-            <w:r/>
-            <w:r>
-              <w:rPr>
-                <w:rFonts w:ascii="Calibri" w:hAnsi="Calibri"/>
-                <w:b w:val="0"/>
-                <w:color w:val="333333"/>
-                <w:sz w:val="18"/>
-              </w:rPr>
-              <w:t>44.6%</w:t>
-            </w:r>
-          </w:p>
-        </w:tc>
-        <w:tc>
-          <w:tcPr>
-            <w:tcW w:type="dxa" w:w="1296"/>
-            <w:shd w:fill="DBE5F1" w:val="clear"/>
-          </w:tcPr>
-          <w:p>
-            <w:pPr>
-              <w:spacing w:before="40" w:after="40"/>
-              <w:jc w:val="center"/>
-            </w:pPr>
-            <w:r/>
-            <w:r>
-              <w:rPr>
-                <w:rFonts w:ascii="Calibri" w:hAnsi="Calibri"/>
-                <w:b w:val="0"/>
-                <w:color w:val="333333"/>
-                <w:sz w:val="18"/>
-              </w:rPr>
-              <w:t>29.6%</w:t>
+              <w:t>26.5%</w:t>
             </w:r>
           </w:p>
         </w:tc>
@@ -4946,7 +4703,7 @@
                 <w:color w:val="333333"/>
                 <w:sz w:val="18"/>
               </w:rPr>
-              <w:t>46,780</w:t>
+              <w:t>44,384</w:t>
             </w:r>
           </w:p>
         </w:tc>
@@ -4967,7 +4724,7 @@
                 <w:color w:val="333333"/>
                 <w:sz w:val="18"/>
               </w:rPr>
-              <w:t>11,742</w:t>
+              <w:t>13,563</w:t>
             </w:r>
           </w:p>
         </w:tc>
@@ -4988,7 +4745,7 @@
                 <w:color w:val="333333"/>
                 <w:sz w:val="18"/>
               </w:rPr>
-              <w:t>25.1%</w:t>
+              <w:t>30.6%</w:t>
             </w:r>
           </w:p>
         </w:tc>
@@ -5009,7 +4766,7 @@
                 <w:color w:val="333333"/>
                 <w:sz w:val="18"/>
               </w:rPr>
-              <w:t>40.9%</w:t>
+              <w:t>39.9%</w:t>
             </w:r>
           </w:p>
         </w:tc>
@@ -5030,7 +4787,312 @@
                 <w:color w:val="333333"/>
                 <w:sz w:val="18"/>
               </w:rPr>
-              <w:t>34.0%</w:t>
+              <w:t>29.5%</w:t>
+            </w:r>
+          </w:p>
+        </w:tc>
+      </w:tr>
+      <w:tr>
+        <w:tc>
+          <w:tcPr>
+            <w:tcW w:type="dxa" w:w="720"/>
+            <w:shd w:fill="DBE5F1" w:val="clear"/>
+          </w:tcPr>
+          <w:p>
+            <w:pPr>
+              <w:spacing w:before="40" w:after="40"/>
+              <w:jc w:val="center"/>
+            </w:pPr>
+            <w:r/>
+            <w:r>
+              <w:rPr>
+                <w:rFonts w:ascii="Calibri" w:hAnsi="Calibri"/>
+                <w:b/>
+                <w:color w:val="333333"/>
+                <w:sz w:val="18"/>
+              </w:rPr>
+              <w:t>D1</w:t>
+            </w:r>
+          </w:p>
+        </w:tc>
+        <w:tc>
+          <w:tcPr>
+            <w:tcW w:type="dxa" w:w="2448"/>
+            <w:shd w:fill="DBE5F1" w:val="clear"/>
+          </w:tcPr>
+          <w:p>
+            <w:pPr>
+              <w:spacing w:before="40" w:after="40"/>
+              <w:jc w:val="center"/>
+            </w:pPr>
+            <w:r/>
+            <w:r>
+              <w:rPr>
+                <w:rFonts w:ascii="Calibri" w:hAnsi="Calibri"/>
+                <w:b w:val="0"/>
+                <w:color w:val="333333"/>
+                <w:sz w:val="18"/>
+              </w:rPr>
+              <w:t>Richmond</w:t>
+            </w:r>
+          </w:p>
+        </w:tc>
+        <w:tc>
+          <w:tcPr>
+            <w:tcW w:type="dxa" w:w="1152"/>
+            <w:shd w:fill="DBE5F1" w:val="clear"/>
+          </w:tcPr>
+          <w:p>
+            <w:pPr>
+              <w:spacing w:before="40" w:after="40"/>
+              <w:jc w:val="center"/>
+            </w:pPr>
+            <w:r/>
+            <w:r>
+              <w:rPr>
+                <w:rFonts w:ascii="Calibri" w:hAnsi="Calibri"/>
+                <w:b w:val="0"/>
+                <w:color w:val="333333"/>
+                <w:sz w:val="18"/>
+              </w:rPr>
+              <w:t>46,755</w:t>
+            </w:r>
+          </w:p>
+        </w:tc>
+        <w:tc>
+          <w:tcPr>
+            <w:tcW w:type="dxa" w:w="1152"/>
+            <w:shd w:fill="DBE5F1" w:val="clear"/>
+          </w:tcPr>
+          <w:p>
+            <w:pPr>
+              <w:spacing w:before="40" w:after="40"/>
+              <w:jc w:val="center"/>
+            </w:pPr>
+            <w:r/>
+            <w:r>
+              <w:rPr>
+                <w:rFonts w:ascii="Calibri" w:hAnsi="Calibri"/>
+                <w:b w:val="0"/>
+                <w:color w:val="333333"/>
+                <w:sz w:val="18"/>
+              </w:rPr>
+              <w:t>12,467</w:t>
+            </w:r>
+          </w:p>
+        </w:tc>
+        <w:tc>
+          <w:tcPr>
+            <w:tcW w:type="dxa" w:w="1008"/>
+            <w:shd w:fill="DBE5F1" w:val="clear"/>
+          </w:tcPr>
+          <w:p>
+            <w:pPr>
+              <w:spacing w:before="40" w:after="40"/>
+              <w:jc w:val="center"/>
+            </w:pPr>
+            <w:r/>
+            <w:r>
+              <w:rPr>
+                <w:rFonts w:ascii="Calibri" w:hAnsi="Calibri"/>
+                <w:b w:val="0"/>
+                <w:color w:val="333333"/>
+                <w:sz w:val="18"/>
+              </w:rPr>
+              <w:t>26.7%</w:t>
+            </w:r>
+          </w:p>
+        </w:tc>
+        <w:tc>
+          <w:tcPr>
+            <w:tcW w:type="dxa" w:w="1296"/>
+            <w:shd w:fill="DBE5F1" w:val="clear"/>
+          </w:tcPr>
+          <w:p>
+            <w:pPr>
+              <w:spacing w:before="40" w:after="40"/>
+              <w:jc w:val="center"/>
+            </w:pPr>
+            <w:r/>
+            <w:r>
+              <w:rPr>
+                <w:rFonts w:ascii="Calibri" w:hAnsi="Calibri"/>
+                <w:b w:val="0"/>
+                <w:color w:val="333333"/>
+                <w:sz w:val="18"/>
+              </w:rPr>
+              <w:t>42.0%</w:t>
+            </w:r>
+          </w:p>
+        </w:tc>
+        <w:tc>
+          <w:tcPr>
+            <w:tcW w:type="dxa" w:w="1296"/>
+            <w:shd w:fill="DBE5F1" w:val="clear"/>
+          </w:tcPr>
+          <w:p>
+            <w:pPr>
+              <w:spacing w:before="40" w:after="40"/>
+              <w:jc w:val="center"/>
+            </w:pPr>
+            <w:r/>
+            <w:r>
+              <w:rPr>
+                <w:rFonts w:ascii="Calibri" w:hAnsi="Calibri"/>
+                <w:b w:val="0"/>
+                <w:color w:val="333333"/>
+                <w:sz w:val="18"/>
+              </w:rPr>
+              <w:t>31.3%</w:t>
+            </w:r>
+          </w:p>
+        </w:tc>
+      </w:tr>
+      <w:tr>
+        <w:tc>
+          <w:tcPr>
+            <w:tcW w:type="dxa" w:w="720"/>
+          </w:tcPr>
+          <w:p>
+            <w:pPr>
+              <w:spacing w:before="40" w:after="40"/>
+              <w:jc w:val="center"/>
+            </w:pPr>
+            <w:r/>
+            <w:r>
+              <w:rPr>
+                <w:rFonts w:ascii="Calibri" w:hAnsi="Calibri"/>
+                <w:b/>
+                <w:color w:val="333333"/>
+                <w:sz w:val="18"/>
+              </w:rPr>
+              <w:t>D4</w:t>
+            </w:r>
+          </w:p>
+        </w:tc>
+        <w:tc>
+          <w:tcPr>
+            <w:tcW w:type="dxa" w:w="2448"/>
+          </w:tcPr>
+          <w:p>
+            <w:pPr>
+              <w:spacing w:before="40" w:after="40"/>
+              <w:jc w:val="center"/>
+            </w:pPr>
+            <w:r/>
+            <w:r>
+              <w:rPr>
+                <w:rFonts w:ascii="Calibri" w:hAnsi="Calibri"/>
+                <w:b w:val="0"/>
+                <w:color w:val="333333"/>
+                <w:sz w:val="18"/>
+              </w:rPr>
+              <w:t>Sunset / Parkside</w:t>
+            </w:r>
+          </w:p>
+        </w:tc>
+        <w:tc>
+          <w:tcPr>
+            <w:tcW w:type="dxa" w:w="1152"/>
+          </w:tcPr>
+          <w:p>
+            <w:pPr>
+              <w:spacing w:before="40" w:after="40"/>
+              <w:jc w:val="center"/>
+            </w:pPr>
+            <w:r/>
+            <w:r>
+              <w:rPr>
+                <w:rFonts w:ascii="Calibri" w:hAnsi="Calibri"/>
+                <w:b w:val="0"/>
+                <w:color w:val="333333"/>
+                <w:sz w:val="18"/>
+              </w:rPr>
+              <w:t>48,802</w:t>
+            </w:r>
+          </w:p>
+        </w:tc>
+        <w:tc>
+          <w:tcPr>
+            <w:tcW w:type="dxa" w:w="1152"/>
+          </w:tcPr>
+          <w:p>
+            <w:pPr>
+              <w:spacing w:before="40" w:after="40"/>
+              <w:jc w:val="center"/>
+            </w:pPr>
+            <w:r/>
+            <w:r>
+              <w:rPr>
+                <w:rFonts w:ascii="Calibri" w:hAnsi="Calibri"/>
+                <w:b w:val="0"/>
+                <w:color w:val="333333"/>
+                <w:sz w:val="18"/>
+              </w:rPr>
+              <w:t>12,648</w:t>
+            </w:r>
+          </w:p>
+        </w:tc>
+        <w:tc>
+          <w:tcPr>
+            <w:tcW w:type="dxa" w:w="1008"/>
+          </w:tcPr>
+          <w:p>
+            <w:pPr>
+              <w:spacing w:before="40" w:after="40"/>
+              <w:jc w:val="center"/>
+            </w:pPr>
+            <w:r/>
+            <w:r>
+              <w:rPr>
+                <w:rFonts w:ascii="Calibri" w:hAnsi="Calibri"/>
+                <w:b w:val="0"/>
+                <w:color w:val="333333"/>
+                <w:sz w:val="18"/>
+              </w:rPr>
+              <w:t>25.9%</w:t>
+            </w:r>
+          </w:p>
+        </w:tc>
+        <w:tc>
+          <w:tcPr>
+            <w:tcW w:type="dxa" w:w="1296"/>
+          </w:tcPr>
+          <w:p>
+            <w:pPr>
+              <w:spacing w:before="40" w:after="40"/>
+              <w:jc w:val="center"/>
+            </w:pPr>
+            <w:r/>
+            <w:r>
+              <w:rPr>
+                <w:rFonts w:ascii="Calibri" w:hAnsi="Calibri"/>
+                <w:b w:val="0"/>
+                <w:color w:val="333333"/>
+                <w:sz w:val="18"/>
+              </w:rPr>
+              <w:t>42.1%</w:t>
+            </w:r>
+          </w:p>
+        </w:tc>
+        <w:tc>
+          <w:tcPr>
+            <w:tcW w:type="dxa" w:w="1296"/>
+          </w:tcPr>
+          <w:p>
+            <w:pPr>
+              <w:spacing w:before="40" w:after="40"/>
+              <w:jc w:val="center"/>
+            </w:pPr>
+            <w:r/>
+            <w:r>
+              <w:rPr>
+                <w:rFonts w:ascii="Calibri" w:hAnsi="Calibri"/>
+                <w:b w:val="0"/>
+                <w:color w:val="333333"/>
+                <w:sz w:val="18"/>
+              </w:rPr>
+              <w:t>32.0%</w:t>
             </w:r>
           </w:p>
         </w:tc>
@@ -5098,7 +5160,7 @@
                 <w:color w:val="333333"/>
                 <w:sz w:val="18"/>
               </w:rPr>
-              <w:t>49,046</w:t>
+              <w:t>32,926</w:t>
             </w:r>
           </w:p>
         </w:tc>
@@ -5120,7 +5182,7 @@
                 <w:color w:val="333333"/>
                 <w:sz w:val="18"/>
               </w:rPr>
-              <w:t>9,112</w:t>
+              <w:t>6,267</w:t>
             </w:r>
           </w:p>
         </w:tc>
@@ -5142,7 +5204,7 @@
                 <w:color w:val="333333"/>
                 <w:sz w:val="18"/>
               </w:rPr>
-              <w:t>18.6%</w:t>
+              <w:t>19.0%</w:t>
             </w:r>
           </w:p>
         </w:tc>
@@ -5164,7 +5226,7 @@
                 <w:color w:val="333333"/>
                 <w:sz w:val="18"/>
               </w:rPr>
-              <w:t>40.1%</w:t>
+              <w:t>34.6%</w:t>
             </w:r>
           </w:p>
         </w:tc>
@@ -5186,7 +5248,7 @@
                 <w:color w:val="333333"/>
                 <w:sz w:val="18"/>
               </w:rPr>
-              <w:t>41.3%</w:t>
+              <w:t>46.4%</w:t>
             </w:r>
           </w:p>
         </w:tc>
@@ -5228,7 +5290,7 @@
           <w:color w:val="333333"/>
           <w:sz w:val="22"/>
         </w:rPr>
-        <w:t>District 8 (Castro/Noe Valley) is Scott’s strongest district at 54.8% Base — LGBTQ+ concentration, long-standing constituent relationships.</w:t>
+        <w:t>District 8 (Castro/Noe Valley) is Scott’s strongest district at 55.3% Base — LGBTQ+ concentration, long-standing constituent relationships.</w:t>
       </w:r>
     </w:p>
     <w:p>
@@ -5276,7 +5338,7 @@
           <w:color w:val="333333"/>
           <w:sz w:val="22"/>
         </w:rPr>
-        <w:t>District 5 (Haight/Western Addition) is the progressive stronghold most favorable to Saikat Chakrabarti. Only 25.1% Base with 34.0% Opposition — the campaign should contest moderate progressives here but not over-invest.</w:t>
+        <w:t>District 5 (Haight/Western Addition) is the progressive stronghold most favorable to Saikat Chakrabarti. At 30.6% Base with 29.5% Opposition — the blended polling data shows stronger-than-expected support here; targeted outreach to moderate progressives is warranted.</w:t>
       </w:r>
     </w:p>
     <w:p>
@@ -5300,7 +5362,7 @@
           <w:color w:val="333333"/>
           <w:sz w:val="22"/>
         </w:rPr>
-        <w:t>District 4 (Sunset) is heavily API with the highest Persuasion share (44.6%). Culturally tailored messaging could yield significant gains.</w:t>
+        <w:t>District 4 (Sunset) is heavily API with the highest Persuasion share (42.1%). Culturally tailored messaging could yield significant gains.</w:t>
       </w:r>
     </w:p>
     <w:p>
@@ -5324,7 +5386,7 @@
           <w:color w:val="333333"/>
           <w:sz w:val="22"/>
         </w:rPr>
-        <w:t>District 10 (Bayview/Potrero Hill) has the lowest Base share (18.6%) and highest Opposition (41.3%). Resources should be allocated elsewhere.</w:t>
+        <w:t>District 10 (Bayview/Potrero Hill) has the lowest Base share (19.0%) and highest Opposition (46.4%). Resources should be allocated elsewhere.</w:t>
       </w:r>
     </w:p>
     <w:p>
@@ -5355,7 +5417,7 @@
           <w:color w:val="1B2A4A"/>
           <w:sz w:val="24"/>
         </w:rPr>
-        <w:t>A. Mobilization Priority: Drop-off Base (62,725 voters)</w:t>
+        <w:t>A. Mobilization Priority: Drop-off Base (66,155 voters)</w:t>
       </w:r>
     </w:p>
     <w:p>
@@ -5370,7 +5432,7 @@
           <w:color w:val="333333"/>
           <w:sz w:val="22"/>
         </w:rPr>
-        <w:t>The single highest-ROI investment this campaign can make is mobilizing the 62,725 Base voters whose turnout probability score falls below 45 (on the 0–100 scale). These individuals already support Scott but are unlikely to vote in a June primary without direct outreach. Every vote earned here comes from an existing supporter — no persuasion required.</w:t>
+        <w:t>The single highest-ROI investment this campaign can make is mobilizing the 66,155 Base voters with low turnout probability. These individuals already support Scott but are unlikely to vote in a June primary without direct outreach. Every vote earned here comes from an existing supporter — no persuasion required.</w:t>
       </w:r>
     </w:p>
     <w:p>
@@ -5496,7 +5558,7 @@
           <w:color w:val="333333"/>
           <w:sz w:val="22"/>
         </w:rPr>
-        <w:t>The Persuasion universe is large (167,890) but heterogeneous. The campaign should focus paid media, direct mail, and field resources on five high-impact sub-segments with tailored messaging.</w:t>
+        <w:t>The Persuasion universe is large (168,183) but heterogeneous. The campaign should focus paid media, direct mail, and field resources on five high-impact sub-segments with tailored messaging.</w:t>
       </w:r>
     </w:p>
     <w:p>
@@ -5768,7 +5830,7 @@
                 <w:color w:val="333333"/>
                 <w:sz w:val="18"/>
               </w:rPr>
-              <w:t>9,714</w:t>
+              <w:t>9,331</w:t>
             </w:r>
           </w:p>
         </w:tc>
@@ -5835,7 +5897,7 @@
                 <w:color w:val="333333"/>
                 <w:sz w:val="18"/>
               </w:rPr>
-              <w:t>37,231</w:t>
+              <w:t>37,232</w:t>
             </w:r>
           </w:p>
         </w:tc>
@@ -5968,7 +6030,7 @@
                 <w:color w:val="333333"/>
                 <w:sz w:val="18"/>
               </w:rPr>
-              <w:t>58,820</w:t>
+              <w:t>52,424</w:t>
             </w:r>
           </w:p>
         </w:tc>
@@ -6615,6 +6677,25 @@
         </w:pBdr>
       </w:pPr>
     </w:p>
+    <w:p>
+      <w:pPr>
+        <w:spacing w:before="200"/>
+        <w:jc w:val="center"/>
+      </w:pPr>
+      <w:r>
+        <w:rPr>
+          <w:rFonts w:ascii="Calibri" w:hAnsi="Calibri"/>
+          <w:i/>
+          <w:color w:val="666666"/>
+          <w:sz w:val="20"/>
+        </w:rPr>
+        <w:t>Prepared by the Data &amp; Analytics Team — April 2026</w:t>
+        <w:br/>
+        <w:t>Scott Wiener for Congress</w:t>
+        <w:br/>
+        <w:t>CONFIDENTIAL — Do Not Distribute</w:t>
+      </w:r>
+    </w:p>
     <w:sectPr>
       <w:headerReference w:type="default" r:id="rId9"/>
       <w:footerReference w:type="default" r:id="rId10"/>
@@ -6641,7 +6722,7 @@
         <w:color w:val="666666"/>
         <w:sz w:val="16"/>
       </w:rPr>
-      <w:t xml:space="preserve">Scott Wiener for Congress  —  Page </w:t>
+      <w:t xml:space="preserve">CONFIDENTIAL  —  Scott Wiener for Congress  —  Page </w:t>
     </w:r>
     <w:r>
       <w:rPr>

</xml_diff>